<commit_message>
Session 2C - break-glass accounts created, Global Admin assigned, excluded from CA policies
</commit_message>
<xml_diff>
--- a/omarp.docx
+++ b/omarp.docx
@@ -51,13 +51,20 @@
         </w:rPr>
         <w:t>Chosen2k7</w:t>
       </w:r>
-      <w:bookmarkStart w:id="0" w:name="_GoBack"/>
-      <w:bookmarkEnd w:id="0"/>
     </w:p>
     <w:p>
       <w:pPr>
-        <w:spacing w:before="100" w:beforeAutospacing="1" w:after="100" w:afterAutospacing="1" w:line="240" w:lineRule="auto"/>
-        <w:outlineLvl w:val="2"/>
+        <w:shd w:val="clear" w:color="auto" w:fill="121314"/>
+        <w:spacing w:line="285" w:lineRule="atLeast"/>
+        <w:rPr>
+          <w:rFonts w:ascii="Consolas" w:eastAsia="Times New Roman" w:hAnsi="Consolas" w:cs="Times New Roman"/>
+          <w:color w:val="BBBEBF"/>
+          <w:sz w:val="21"/>
+          <w:szCs w:val="21"/>
+          <w:lang w:eastAsia="en-GB"/>
+        </w:rPr>
+      </w:pPr>
+      <w:r>
         <w:rPr>
           <w:rFonts w:ascii="Times New Roman" w:eastAsia="Times New Roman" w:hAnsi="Times New Roman" w:cs="Times New Roman"/>
           <w:b/>
@@ -66,7 +73,8 @@
           <w:szCs w:val="27"/>
           <w:lang w:eastAsia="en-GB"/>
         </w:rPr>
-      </w:pPr>
+        <w:t>breakglass1@passion2k7.onmicrosoft.com</w:t>
+      </w:r>
       <w:r>
         <w:rPr>
           <w:rFonts w:ascii="Times New Roman" w:eastAsia="Times New Roman" w:hAnsi="Times New Roman" w:cs="Times New Roman"/>
@@ -76,9 +84,177 @@
           <w:szCs w:val="27"/>
           <w:lang w:eastAsia="en-GB"/>
         </w:rPr>
+        <w:t xml:space="preserve"> | </w:t>
+      </w:r>
+      <w:r>
+        <w:rPr>
+          <w:rFonts w:ascii="Consolas" w:eastAsia="Times New Roman" w:hAnsi="Consolas" w:cs="Times New Roman"/>
+          <w:color w:val="A5D6FF"/>
+          <w:sz w:val="21"/>
+          <w:szCs w:val="21"/>
+          <w:lang w:eastAsia="en-GB"/>
+        </w:rPr>
+        <w:t>Br3akGl@</w:t>
+      </w:r>
+      <w:proofErr w:type="gramStart"/>
+      <w:r>
+        <w:rPr>
+          <w:rFonts w:ascii="Consolas" w:eastAsia="Times New Roman" w:hAnsi="Consolas" w:cs="Times New Roman"/>
+          <w:color w:val="A5D6FF"/>
+          <w:sz w:val="21"/>
+          <w:szCs w:val="21"/>
+          <w:lang w:eastAsia="en-GB"/>
+        </w:rPr>
+        <w:t>ss!Lab</w:t>
+      </w:r>
+      <w:proofErr w:type="gramEnd"/>
+      <w:r>
+        <w:rPr>
+          <w:rFonts w:ascii="Consolas" w:eastAsia="Times New Roman" w:hAnsi="Consolas" w:cs="Times New Roman"/>
+          <w:color w:val="A5D6FF"/>
+          <w:sz w:val="21"/>
+          <w:szCs w:val="21"/>
+          <w:lang w:eastAsia="en-GB"/>
+        </w:rPr>
+        <w:t>2026#1</w:t>
+      </w:r>
+    </w:p>
+    <w:p>
+      <w:pPr>
+        <w:spacing w:before="100" w:beforeAutospacing="1" w:after="100" w:afterAutospacing="1" w:line="240" w:lineRule="auto"/>
+        <w:outlineLvl w:val="2"/>
+        <w:rPr>
+          <w:rFonts w:ascii="Times New Roman" w:eastAsia="Times New Roman" w:hAnsi="Times New Roman" w:cs="Times New Roman"/>
+          <w:b/>
+          <w:bCs/>
+          <w:sz w:val="27"/>
+          <w:szCs w:val="27"/>
+          <w:lang w:eastAsia="en-GB"/>
+        </w:rPr>
+      </w:pPr>
+    </w:p>
+    <w:p>
+      <w:pPr>
+        <w:shd w:val="clear" w:color="auto" w:fill="121314"/>
+        <w:spacing w:line="285" w:lineRule="atLeast"/>
+        <w:rPr>
+          <w:rFonts w:ascii="Consolas" w:eastAsia="Times New Roman" w:hAnsi="Consolas" w:cs="Times New Roman"/>
+          <w:color w:val="BBBEBF"/>
+          <w:sz w:val="21"/>
+          <w:szCs w:val="21"/>
+          <w:lang w:eastAsia="en-GB"/>
+        </w:rPr>
+      </w:pPr>
+      <w:r>
+        <w:rPr>
+          <w:rFonts w:ascii="Times New Roman" w:eastAsia="Times New Roman" w:hAnsi="Times New Roman" w:cs="Times New Roman"/>
+          <w:b/>
+          <w:bCs/>
+          <w:sz w:val="27"/>
+          <w:szCs w:val="27"/>
+          <w:lang w:eastAsia="en-GB"/>
+        </w:rPr>
+        <w:t>breakglass2@passion2k7.onmicrosoft.com</w:t>
+      </w:r>
+      <w:r>
+        <w:rPr>
+          <w:rFonts w:ascii="Times New Roman" w:eastAsia="Times New Roman" w:hAnsi="Times New Roman" w:cs="Times New Roman"/>
+          <w:b/>
+          <w:bCs/>
+          <w:sz w:val="27"/>
+          <w:szCs w:val="27"/>
+          <w:lang w:eastAsia="en-GB"/>
+        </w:rPr>
+        <w:t xml:space="preserve"> | </w:t>
+      </w:r>
+      <w:r>
+        <w:rPr>
+          <w:rFonts w:ascii="Consolas" w:eastAsia="Times New Roman" w:hAnsi="Consolas" w:cs="Times New Roman"/>
+          <w:color w:val="A5D6FF"/>
+          <w:sz w:val="21"/>
+          <w:szCs w:val="21"/>
+          <w:lang w:eastAsia="en-GB"/>
+        </w:rPr>
+        <w:t>Br3akGl@</w:t>
+      </w:r>
+      <w:proofErr w:type="gramStart"/>
+      <w:r>
+        <w:rPr>
+          <w:rFonts w:ascii="Consolas" w:eastAsia="Times New Roman" w:hAnsi="Consolas" w:cs="Times New Roman"/>
+          <w:color w:val="A5D6FF"/>
+          <w:sz w:val="21"/>
+          <w:szCs w:val="21"/>
+          <w:lang w:eastAsia="en-GB"/>
+        </w:rPr>
+        <w:t>ss!Lab</w:t>
+      </w:r>
+      <w:proofErr w:type="gramEnd"/>
+      <w:r>
+        <w:rPr>
+          <w:rFonts w:ascii="Consolas" w:eastAsia="Times New Roman" w:hAnsi="Consolas" w:cs="Times New Roman"/>
+          <w:color w:val="A5D6FF"/>
+          <w:sz w:val="21"/>
+          <w:szCs w:val="21"/>
+          <w:lang w:eastAsia="en-GB"/>
+        </w:rPr>
+        <w:t>2026#2</w:t>
+      </w:r>
+    </w:p>
+    <w:p>
+      <w:pPr>
+        <w:spacing w:before="100" w:beforeAutospacing="1" w:after="100" w:afterAutospacing="1" w:line="240" w:lineRule="auto"/>
+        <w:outlineLvl w:val="2"/>
+        <w:rPr>
+          <w:rFonts w:ascii="Times New Roman" w:eastAsia="Times New Roman" w:hAnsi="Times New Roman" w:cs="Times New Roman"/>
+          <w:b/>
+          <w:bCs/>
+          <w:sz w:val="27"/>
+          <w:szCs w:val="27"/>
+          <w:lang w:eastAsia="en-GB"/>
+        </w:rPr>
+      </w:pPr>
+    </w:p>
+    <w:p>
+      <w:pPr>
+        <w:spacing w:before="100" w:beforeAutospacing="1" w:after="100" w:afterAutospacing="1" w:line="240" w:lineRule="auto"/>
+        <w:outlineLvl w:val="2"/>
+        <w:rPr>
+          <w:rFonts w:ascii="Times New Roman" w:eastAsia="Times New Roman" w:hAnsi="Times New Roman" w:cs="Times New Roman"/>
+          <w:b/>
+          <w:bCs/>
+          <w:sz w:val="27"/>
+          <w:szCs w:val="27"/>
+          <w:lang w:eastAsia="en-GB"/>
+        </w:rPr>
+      </w:pPr>
+    </w:p>
+    <w:p>
+      <w:pPr>
+        <w:spacing w:before="100" w:beforeAutospacing="1" w:after="100" w:afterAutospacing="1" w:line="240" w:lineRule="auto"/>
+        <w:outlineLvl w:val="2"/>
+        <w:rPr>
+          <w:rFonts w:ascii="Times New Roman" w:eastAsia="Times New Roman" w:hAnsi="Times New Roman" w:cs="Times New Roman"/>
+          <w:b/>
+          <w:bCs/>
+          <w:sz w:val="27"/>
+          <w:szCs w:val="27"/>
+          <w:lang w:eastAsia="en-GB"/>
+        </w:rPr>
+      </w:pPr>
+      <w:bookmarkStart w:id="0" w:name="_GoBack"/>
+      <w:r>
+        <w:rPr>
+          <w:rFonts w:ascii="Times New Roman" w:eastAsia="Times New Roman" w:hAnsi="Times New Roman" w:cs="Times New Roman"/>
+          <w:b/>
+          <w:bCs/>
+          <w:sz w:val="27"/>
+          <w:szCs w:val="27"/>
+          <w:lang w:eastAsia="en-GB"/>
+        </w:rPr>
         <w:t>What will actually get you writing it</w:t>
       </w:r>
     </w:p>
+    <w:bookmarkEnd w:id="0"/>
     <w:p>
       <w:pPr>
         <w:spacing w:before="100" w:beforeAutospacing="1" w:after="100" w:afterAutospacing="1" w:line="240" w:lineRule="auto"/>
@@ -969,6 +1145,29 @@
       <w:szCs w:val="20"/>
     </w:rPr>
   </w:style>
+  <w:style w:type="character" w:styleId="Hyperlink">
+    <w:name w:val="Hyperlink"/>
+    <w:basedOn w:val="DefaultParagraphFont"/>
+    <w:uiPriority w:val="99"/>
+    <w:unhideWhenUsed/>
+    <w:rsid w:val="00030F3F"/>
+    <w:rPr>
+      <w:color w:val="0563C1" w:themeColor="hyperlink"/>
+      <w:u w:val="single"/>
+    </w:rPr>
+  </w:style>
+  <w:style w:type="character" w:styleId="UnresolvedMention">
+    <w:name w:val="Unresolved Mention"/>
+    <w:basedOn w:val="DefaultParagraphFont"/>
+    <w:uiPriority w:val="99"/>
+    <w:semiHidden/>
+    <w:unhideWhenUsed/>
+    <w:rsid w:val="00030F3F"/>
+    <w:rPr>
+      <w:color w:val="605E5C"/>
+      <w:shd w:val="clear" w:color="auto" w:fill="E1DFDD"/>
+    </w:rPr>
+  </w:style>
 </w:styles>
 </file>
 

</xml_diff>